<commit_message>
docs(kenan): add project plan and update decision log
Added 'Project plan and Action plan' folder under docs.
Updated Decision Log docx.

— Kenan
</commit_message>
<xml_diff>
--- a/docs/DL's/Decision_Log_PRP2_Project_Choice_Fine_Tuning_Recreated.docx
+++ b/docs/DL's/Decision_Log_PRP2_Project_Choice_Fine_Tuning_Recreated.docx
@@ -293,13 +293,29 @@
       <w:r>
         <w:t xml:space="preserve">The Learning Outcomes also describe the GenAI Engineer focus as technical feasibility, models, APIs, integrations, performance, experiments, working code, and benchmarks. </w:t>
       </w:r>
-      <w:r>
-        <w:rPr>
-          <w:b/>
-          <w:color w:val="1F4E79"/>
-        </w:rPr>
-        <w:t>@GenAI Learning Outcomes</w:t>
-      </w:r>
+      <w:hyperlink r:id="rId8" w:history="1">
+        <w:r>
+          <w:rPr>
+            <w:rStyle w:val="Hyperlink"/>
+            <w:b/>
+          </w:rPr>
+          <w:t>@GenAI Lear</w:t>
+        </w:r>
+        <w:r>
+          <w:rPr>
+            <w:rStyle w:val="Hyperlink"/>
+            <w:b/>
+          </w:rPr>
+          <w:t>n</w:t>
+        </w:r>
+        <w:r>
+          <w:rPr>
+            <w:rStyle w:val="Hyperlink"/>
+            <w:b/>
+          </w:rPr>
+          <w:t>ing Outcomes</w:t>
+        </w:r>
+      </w:hyperlink>
     </w:p>
     <w:p>
       <w:pPr>
@@ -596,61 +612,6 @@
           </w:p>
         </w:tc>
       </w:tr>
-      <w:tr>
-        <w:trPr>
-          <w:jc w:val="center"/>
-        </w:trPr>
-        <w:tc>
-          <w:tcPr>
-            <w:tcW w:w="5040" w:type="dxa"/>
-            <w:tcBorders>
-              <w:top w:val="single" w:sz="6" w:space="0" w:color="D9E2EC"/>
-              <w:left w:val="single" w:sz="6" w:space="0" w:color="D9E2EC"/>
-              <w:bottom w:val="single" w:sz="6" w:space="0" w:color="D9E2EC"/>
-              <w:right w:val="single" w:sz="6" w:space="0" w:color="D9E2EC"/>
-            </w:tcBorders>
-            <w:shd w:val="clear" w:color="auto" w:fill="F7FAFC"/>
-            <w:vAlign w:val="center"/>
-          </w:tcPr>
-          <w:p>
-            <w:pPr>
-              <w:spacing w:after="0"/>
-            </w:pPr>
-            <w:r>
-              <w:rPr>
-                <w:b/>
-                <w:color w:val="1F4E79"/>
-                <w:sz w:val="18"/>
-              </w:rPr>
-              <w:t>Realistic and non-repetitive scope</w:t>
-            </w:r>
-          </w:p>
-        </w:tc>
-        <w:tc>
-          <w:tcPr>
-            <w:tcW w:w="5040" w:type="dxa"/>
-            <w:tcBorders>
-              <w:top w:val="single" w:sz="6" w:space="0" w:color="D9E2EC"/>
-              <w:left w:val="single" w:sz="6" w:space="0" w:color="D9E2EC"/>
-              <w:bottom w:val="single" w:sz="6" w:space="0" w:color="D9E2EC"/>
-              <w:right w:val="single" w:sz="6" w:space="0" w:color="D9E2EC"/>
-            </w:tcBorders>
-            <w:shd w:val="clear" w:color="auto" w:fill="F7FAFC"/>
-            <w:vAlign w:val="center"/>
-          </w:tcPr>
-          <w:p>
-            <w:pPr>
-              <w:spacing w:after="0"/>
-            </w:pPr>
-            <w:r>
-              <w:rPr>
-                <w:sz w:val="18"/>
-              </w:rPr>
-              <w:t>The project should be possible with student-level time and resources</w:t>
-            </w:r>
-          </w:p>
-        </w:tc>
-      </w:tr>
     </w:tbl>
     <w:p>
       <w:pPr>
@@ -728,6 +689,7 @@
       </w:r>
     </w:p>
     <w:p>
+      <w:proofErr w:type="spellStart"/>
       <w:r>
         <w:rPr>
           <w:b/>
@@ -735,8 +697,15 @@
         </w:rPr>
         <w:t>StackEval</w:t>
       </w:r>
+      <w:proofErr w:type="spellEnd"/>
       <w:r>
-        <w:t xml:space="preserve"> was one of the strongest GenAI Engineer options. However, I already completed StackEval as my first Professional Research Project. </w:t>
+        <w:t xml:space="preserve"> </w:t>
+      </w:r>
+      <w:r>
+        <w:t xml:space="preserve">project </w:t>
+      </w:r>
+      <w:r>
+        <w:t xml:space="preserve">was one of the strongest GenAI Engineer options. However, I already completed StackEval as my first Professional Research Project. </w:t>
       </w:r>
     </w:p>
     <w:p>
@@ -763,19 +732,68 @@
       <w:r>
         <w:t xml:space="preserve">Just an example </w:t>
       </w:r>
-      <w:hyperlink r:id="rId8" w:history="1">
+      <w:hyperlink r:id="rId9" w:history="1">
         <w:r>
           <w:rPr>
             <w:rStyle w:val="Hyperlink"/>
           </w:rPr>
-          <w:t>@RAG_Strategy_Benchmark</w:t>
+          <w:t>@RAG_Strategy_B</w:t>
+        </w:r>
+        <w:r>
+          <w:rPr>
+            <w:rStyle w:val="Hyperlink"/>
+          </w:rPr>
+          <w:t>e</w:t>
+        </w:r>
+        <w:r>
+          <w:rPr>
+            <w:rStyle w:val="Hyperlink"/>
+          </w:rPr>
+          <w:t>nchmark</w:t>
         </w:r>
       </w:hyperlink>
     </w:p>
     <w:p>
       <w:r>
-        <w:t>The other available projects were also checked, but most of them focus more on memory systems, autonomous agents, API/tool integration, or creative multi-modal production. These directions are useful, but they are less connected to my PRP2 goal of learning model adaptation and fine-tuning. @Engineer Role-Based Project Order</w:t>
+        <w:t xml:space="preserve">The other available projects were also checked, but most of them focus more on memory systems, autonomous agents, API/tool integration, or creative multi-modal production. These directions are useful, but they are less connected to my PRP2 goal of learning model adaptation and fine-tuning. </w:t>
       </w:r>
+      <w:hyperlink r:id="rId10" w:history="1">
+        <w:r>
+          <w:rPr>
+            <w:rStyle w:val="Hyperlink"/>
+            <w:b/>
+          </w:rPr>
+          <w:t>@Engine</w:t>
+        </w:r>
+        <w:r>
+          <w:rPr>
+            <w:rStyle w:val="Hyperlink"/>
+            <w:b/>
+          </w:rPr>
+          <w:t>e</w:t>
+        </w:r>
+        <w:r>
+          <w:rPr>
+            <w:rStyle w:val="Hyperlink"/>
+            <w:b/>
+          </w:rPr>
+          <w:t>r Role-Bas</w:t>
+        </w:r>
+        <w:r>
+          <w:rPr>
+            <w:rStyle w:val="Hyperlink"/>
+            <w:b/>
+          </w:rPr>
+          <w:t>e</w:t>
+        </w:r>
+        <w:r>
+          <w:rPr>
+            <w:rStyle w:val="Hyperlink"/>
+            <w:b/>
+          </w:rPr>
+          <w:t>d Project Order</w:t>
+        </w:r>
+      </w:hyperlink>
     </w:p>
     <w:p>
       <w:r>
@@ -788,7 +806,7 @@
       <w:r>
         <w:t xml:space="preserve"> gives me a different technical direction. The project is about creating a small AI writing assistant for a language with limited digital data, and its goal is to test whether a small language model can be fine-tuned with only a small dataset and still provide useful writing suggestions. </w:t>
       </w:r>
-      <w:hyperlink r:id="rId9" w:history="1">
+      <w:hyperlink r:id="rId11" w:history="1">
         <w:r>
           <w:rPr>
             <w:rStyle w:val="Hyperlink"/>
@@ -812,7 +830,7 @@
       <w:r>
         <w:t xml:space="preserve">, a small pre-trained model, efficient fine-tuning such as LoRA or QLoRA, a simple demo, and evaluation with examples that were not used during training. </w:t>
       </w:r>
-      <w:hyperlink r:id="rId10" w:history="1">
+      <w:hyperlink r:id="rId12" w:history="1">
         <w:r>
           <w:rPr>
             <w:rStyle w:val="Hyperlink"/>
@@ -834,7 +852,28 @@
             <w:rStyle w:val="Hyperlink"/>
             <w:b/>
           </w:rPr>
-          <w:t xml:space="preserve"> Clear Project Description</w:t>
+          <w:t xml:space="preserve"> Clear P</w:t>
+        </w:r>
+        <w:r>
+          <w:rPr>
+            <w:rStyle w:val="Hyperlink"/>
+            <w:b/>
+          </w:rPr>
+          <w:t>r</w:t>
+        </w:r>
+        <w:r>
+          <w:rPr>
+            <w:rStyle w:val="Hyperlink"/>
+            <w:b/>
+          </w:rPr>
+          <w:t>o</w:t>
+        </w:r>
+        <w:r>
+          <w:rPr>
+            <w:rStyle w:val="Hyperlink"/>
+            <w:b/>
+          </w:rPr>
+          <w:t>ject Description</w:t>
         </w:r>
       </w:hyperlink>
     </w:p>
@@ -842,13 +881,27 @@
       <w:r>
         <w:t xml:space="preserve">This matters for my role because the project moves me from evaluating existing models toward adapting a model itself. It also lets me investigate whether the model actually learns patterns or only memorizes training data, which connects directly to model reliability. </w:t>
       </w:r>
-      <w:hyperlink r:id="rId11" w:history="1">
+      <w:hyperlink r:id="rId13" w:history="1">
         <w:r>
           <w:rPr>
             <w:rStyle w:val="Hyperlink"/>
             <w:b/>
           </w:rPr>
-          <w:t>@My GenAI Specialization Role</w:t>
+          <w:t>@My GenAI Specializati</w:t>
+        </w:r>
+        <w:r>
+          <w:rPr>
+            <w:rStyle w:val="Hyperlink"/>
+            <w:b/>
+          </w:rPr>
+          <w:t>o</w:t>
+        </w:r>
+        <w:r>
+          <w:rPr>
+            <w:rStyle w:val="Hyperlink"/>
+            <w:b/>
+          </w:rPr>
+          <w:t>n Role</w:t>
         </w:r>
       </w:hyperlink>
     </w:p>
@@ -898,36 +951,15 @@
           <w:lang w:val="en-GB"/>
         </w:rPr>
       </w:pPr>
-      <w:hyperlink r:id="rId12" w:history="1">
+      <w:hyperlink r:id="rId14" w:history="1">
         <w:r>
           <w:rPr>
             <w:rStyle w:val="Hyperlink"/>
             <w:b/>
           </w:rPr>
-          <w:t>@Engineer Role-Bas</w:t>
-        </w:r>
-        <w:r>
-          <w:rPr>
-            <w:rStyle w:val="Hyperlink"/>
-            <w:b/>
-          </w:rPr>
-          <w:t>e</w:t>
-        </w:r>
-        <w:r>
-          <w:rPr>
-            <w:rStyle w:val="Hyperlink"/>
-            <w:b/>
-          </w:rPr>
-          <w:t>d Project Order</w:t>
+          <w:t>@Engineer Role-Based Project Order</w:t>
         </w:r>
       </w:hyperlink>
-      <w:r>
-        <w:rPr>
-          <w:b/>
-          <w:color w:val="1F4E79"/>
-        </w:rPr>
-        <w:t xml:space="preserve"> </w:t>
-      </w:r>
       <w:r>
         <w:rPr>
           <w:lang w:val="en-GB"/>
@@ -946,41 +978,13 @@
           <w:lang w:val="en-GB"/>
         </w:rPr>
       </w:pPr>
-      <w:hyperlink r:id="rId13" w:history="1">
+      <w:hyperlink r:id="rId15" w:history="1">
         <w:r>
           <w:rPr>
             <w:rStyle w:val="Hyperlink"/>
             <w:b/>
           </w:rPr>
-          <w:t>@My GenAI Specia</w:t>
-        </w:r>
-        <w:r>
-          <w:rPr>
-            <w:rStyle w:val="Hyperlink"/>
-            <w:b/>
-          </w:rPr>
-          <w:t>l</w:t>
-        </w:r>
-        <w:r>
-          <w:rPr>
-            <w:rStyle w:val="Hyperlink"/>
-            <w:b/>
-          </w:rPr>
-          <w:t>iz</w:t>
-        </w:r>
-        <w:r>
-          <w:rPr>
-            <w:rStyle w:val="Hyperlink"/>
-            <w:b/>
-          </w:rPr>
-          <w:t>a</w:t>
-        </w:r>
-        <w:r>
-          <w:rPr>
-            <w:rStyle w:val="Hyperlink"/>
-            <w:b/>
-          </w:rPr>
-          <w:t>tion Role</w:t>
+          <w:t>@My GenAI Specialization Role</w:t>
         </w:r>
       </w:hyperlink>
       <w:r>
@@ -1008,7 +1012,7 @@
           <w:lang w:val="en-GB"/>
         </w:rPr>
       </w:pPr>
-      <w:hyperlink r:id="rId14" w:history="1">
+      <w:hyperlink r:id="rId16" w:history="1">
         <w:r>
           <w:rPr>
             <w:rStyle w:val="Hyperlink"/>
@@ -1030,35 +1034,7 @@
             <w:rStyle w:val="Hyperlink"/>
             <w:b/>
           </w:rPr>
-          <w:t xml:space="preserve"> Cl</w:t>
-        </w:r>
-        <w:r>
-          <w:rPr>
-            <w:rStyle w:val="Hyperlink"/>
-            <w:b/>
-          </w:rPr>
-          <w:t>e</w:t>
-        </w:r>
-        <w:r>
-          <w:rPr>
-            <w:rStyle w:val="Hyperlink"/>
-            <w:b/>
-          </w:rPr>
-          <w:t xml:space="preserve">ar </w:t>
-        </w:r>
-        <w:r>
-          <w:rPr>
-            <w:rStyle w:val="Hyperlink"/>
-            <w:b/>
-          </w:rPr>
-          <w:t>P</w:t>
-        </w:r>
-        <w:r>
-          <w:rPr>
-            <w:rStyle w:val="Hyperlink"/>
-            <w:b/>
-          </w:rPr>
-          <w:t>roject Description</w:t>
+          <w:t xml:space="preserve"> Clear Project Description</w:t>
         </w:r>
       </w:hyperlink>
       <w:r>
@@ -1114,7 +1090,7 @@
           <w:lang w:val="en-GB"/>
         </w:rPr>
       </w:pPr>
-      <w:hyperlink r:id="rId15" w:history="1">
+      <w:hyperlink r:id="rId17" w:history="1">
         <w:r>
           <w:rPr>
             <w:rStyle w:val="Hyperlink"/>
@@ -1122,43 +1098,7 @@
             <w:bCs/>
             <w:lang w:val="en-GB"/>
           </w:rPr>
-          <w:t>@Stack</w:t>
-        </w:r>
-        <w:r>
-          <w:rPr>
-            <w:rStyle w:val="Hyperlink"/>
-            <w:b/>
-            <w:bCs/>
-            <w:lang w:val="en-GB"/>
-          </w:rPr>
-          <w:t>E</w:t>
-        </w:r>
-        <w:r>
-          <w:rPr>
-            <w:rStyle w:val="Hyperlink"/>
-            <w:b/>
-            <w:bCs/>
-            <w:lang w:val="en-GB"/>
-          </w:rPr>
-          <w:t>val PRP1 Ev</w:t>
-        </w:r>
-        <w:r>
-          <w:rPr>
-            <w:rStyle w:val="Hyperlink"/>
-            <w:b/>
-            <w:bCs/>
-            <w:lang w:val="en-GB"/>
-          </w:rPr>
-          <w:t>i</w:t>
-        </w:r>
-        <w:r>
-          <w:rPr>
-            <w:rStyle w:val="Hyperlink"/>
-            <w:b/>
-            <w:bCs/>
-            <w:lang w:val="en-GB"/>
-          </w:rPr>
-          <w:t>dence</w:t>
+          <w:t>@StackEval PRP1 Evidence</w:t>
         </w:r>
       </w:hyperlink>
       <w:r>
@@ -1193,24 +1133,12 @@
           <w:lang w:val="en-GB"/>
         </w:rPr>
       </w:pPr>
-      <w:hyperlink r:id="rId16" w:history="1">
+      <w:hyperlink r:id="rId18" w:history="1">
         <w:r>
           <w:rPr>
             <w:rStyle w:val="Hyperlink"/>
           </w:rPr>
-          <w:t>@RAG_Strategy</w:t>
-        </w:r>
-        <w:r>
-          <w:rPr>
-            <w:rStyle w:val="Hyperlink"/>
-          </w:rPr>
-          <w:t>_</w:t>
-        </w:r>
-        <w:r>
-          <w:rPr>
-            <w:rStyle w:val="Hyperlink"/>
-          </w:rPr>
-          <w:t>Benchmark</w:t>
+          <w:t>@RAG_Strategy_Benchmark</w:t>
         </w:r>
       </w:hyperlink>
       <w:r>
@@ -1251,36 +1179,21 @@
     </w:p>
     <w:p>
       <w:r>
-        <w:t xml:space="preserve">I chose the Fine-Tuning project because it fits my GenAI Engineer role, adds a new skill area after </w:t>
+        <w:t>I chose the Fine-Tuning project because it fits my GenAI Engineer role, adds a new skill area</w:t>
       </w:r>
-      <w:proofErr w:type="spellStart"/>
       <w:r>
-        <w:t>StackEval</w:t>
+        <w:t xml:space="preserve">, </w:t>
       </w:r>
-      <w:proofErr w:type="spellEnd"/>
       <w:r>
-        <w:t xml:space="preserve">, avoids overlap with my group project, and can produce clear technical evidence through dataset preparation, fine-tuning, demo output, and evaluation. The scope is also realistic for student-level hardware because the project can be done with a small dataset, a small pre-trained model, and efficient fine-tuning methods such as </w:t>
-      </w:r>
-      <w:proofErr w:type="spellStart"/>
-      <w:r>
-        <w:t>LoRA</w:t>
-      </w:r>
-      <w:proofErr w:type="spellEnd"/>
-      <w:r>
-        <w:t xml:space="preserve"> or </w:t>
-      </w:r>
-      <w:proofErr w:type="spellStart"/>
-      <w:r>
-        <w:t>QLoRA</w:t>
-      </w:r>
-      <w:proofErr w:type="spellEnd"/>
-      <w:r>
-        <w:t>.</w:t>
+        <w:t xml:space="preserve">and can produce clear technical evidence through dataset preparation, fine-tuning, demo output, and evaluation. </w:t>
       </w:r>
     </w:p>
     <w:p>
       <w:pPr>
         <w:pStyle w:val="Heading1"/>
+        <w:rPr>
+          <w:lang w:val="tr-TR"/>
+        </w:rPr>
       </w:pPr>
       <w:r>
         <w:t>6. Does this hold up?</w:t>
@@ -1615,113 +1528,6 @@
           </w:p>
         </w:tc>
       </w:tr>
-      <w:tr>
-        <w:trPr>
-          <w:jc w:val="center"/>
-        </w:trPr>
-        <w:tc>
-          <w:tcPr>
-            <w:tcW w:w="3360" w:type="dxa"/>
-            <w:tcBorders>
-              <w:top w:val="single" w:sz="6" w:space="0" w:color="D9E2EC"/>
-              <w:left w:val="single" w:sz="6" w:space="0" w:color="D9E2EC"/>
-              <w:bottom w:val="single" w:sz="6" w:space="0" w:color="D9E2EC"/>
-              <w:right w:val="single" w:sz="6" w:space="0" w:color="D9E2EC"/>
-            </w:tcBorders>
-            <w:shd w:val="clear" w:color="auto" w:fill="F7FAFC"/>
-            <w:vAlign w:val="center"/>
-          </w:tcPr>
-          <w:p>
-            <w:pPr>
-              <w:spacing w:after="0"/>
-            </w:pPr>
-            <w:r>
-              <w:rPr>
-                <w:b/>
-                <w:color w:val="1F4E79"/>
-                <w:sz w:val="17"/>
-              </w:rPr>
-              <w:t>Realistic and non-repetitive scope</w:t>
-            </w:r>
-          </w:p>
-        </w:tc>
-        <w:tc>
-          <w:tcPr>
-            <w:tcW w:w="3360" w:type="dxa"/>
-            <w:tcBorders>
-              <w:top w:val="single" w:sz="6" w:space="0" w:color="D9E2EC"/>
-              <w:left w:val="single" w:sz="6" w:space="0" w:color="D9E2EC"/>
-              <w:bottom w:val="single" w:sz="6" w:space="0" w:color="D9E2EC"/>
-              <w:right w:val="single" w:sz="6" w:space="0" w:color="D9E2EC"/>
-            </w:tcBorders>
-            <w:shd w:val="clear" w:color="auto" w:fill="F7FAFC"/>
-            <w:vAlign w:val="center"/>
-          </w:tcPr>
-          <w:p>
-            <w:pPr>
-              <w:spacing w:after="0"/>
-            </w:pPr>
-            <w:r>
-              <w:rPr>
-                <w:sz w:val="17"/>
-              </w:rPr>
-              <w:t>Partly achieved / to monitor</w:t>
-            </w:r>
-          </w:p>
-        </w:tc>
-        <w:tc>
-          <w:tcPr>
-            <w:tcW w:w="3360" w:type="dxa"/>
-            <w:tcBorders>
-              <w:top w:val="single" w:sz="6" w:space="0" w:color="D9E2EC"/>
-              <w:left w:val="single" w:sz="6" w:space="0" w:color="D9E2EC"/>
-              <w:bottom w:val="single" w:sz="6" w:space="0" w:color="D9E2EC"/>
-              <w:right w:val="single" w:sz="6" w:space="0" w:color="D9E2EC"/>
-            </w:tcBorders>
-            <w:shd w:val="clear" w:color="auto" w:fill="F7FAFC"/>
-            <w:vAlign w:val="center"/>
-          </w:tcPr>
-          <w:p>
-            <w:pPr>
-              <w:spacing w:after="0"/>
-            </w:pPr>
-            <w:r>
-              <w:rPr>
-                <w:sz w:val="17"/>
-              </w:rPr>
-              <w:t xml:space="preserve">Realistic with student-level hardware if I use a small model, limited dataset, and </w:t>
-            </w:r>
-            <w:proofErr w:type="spellStart"/>
-            <w:r>
-              <w:rPr>
-                <w:sz w:val="17"/>
-              </w:rPr>
-              <w:t>LoRA</w:t>
-            </w:r>
-            <w:proofErr w:type="spellEnd"/>
-            <w:r>
-              <w:rPr>
-                <w:sz w:val="17"/>
-              </w:rPr>
-              <w:t>/</w:t>
-            </w:r>
-            <w:proofErr w:type="spellStart"/>
-            <w:r>
-              <w:rPr>
-                <w:sz w:val="17"/>
-              </w:rPr>
-              <w:t>QLoRA</w:t>
-            </w:r>
-            <w:proofErr w:type="spellEnd"/>
-            <w:r>
-              <w:rPr>
-                <w:sz w:val="17"/>
-              </w:rPr>
-              <w:t xml:space="preserve">. </w:t>
-            </w:r>
-          </w:p>
-        </w:tc>
-      </w:tr>
     </w:tbl>
     <w:p>
       <w:pPr>
@@ -1767,31 +1573,9 @@
       <w:r>
         <w:t xml:space="preserve">What surprised me is that Fine-Tuning is not only about improving model performance. It also forces me to think about whether the model is actually learning patterns or only copying data. That makes the project useful for my model-reliability focus. </w:t>
       </w:r>
-      <w:hyperlink r:id="rId17" w:history="1">
-        <w:r>
-          <w:rPr>
-            <w:rStyle w:val="Hyperlink"/>
-            <w:b/>
-          </w:rPr>
-          <w:t xml:space="preserve">@Guarani </w:t>
-        </w:r>
-        <w:proofErr w:type="spellStart"/>
-        <w:r>
-          <w:rPr>
-            <w:rStyle w:val="Hyperlink"/>
-            <w:b/>
-          </w:rPr>
-          <w:t>Mbya</w:t>
-        </w:r>
-        <w:proofErr w:type="spellEnd"/>
-        <w:r>
-          <w:rPr>
-            <w:rStyle w:val="Hyperlink"/>
-            <w:b/>
-          </w:rPr>
-          <w:t xml:space="preserve"> Clear Project Description</w:t>
-        </w:r>
-      </w:hyperlink>
+      <w:r>
+        <w:t xml:space="preserve"> </w:t>
+      </w:r>
     </w:p>
     <w:p>
       <w:pPr>
@@ -1845,13 +1629,12 @@
     </w:p>
     <w:p>
       <w:r>
-        <w:lastRenderedPageBreak/>
         <w:t>This decision worked if I can deliver a small but complete fine-tuning workflow: dataset preparation, model selection, fine-tuning, demo, and evaluation showing whether the model generalizes or memorizes.</w:t>
       </w:r>
     </w:p>
     <w:sectPr>
-      <w:headerReference w:type="default" r:id="rId18"/>
-      <w:footerReference w:type="default" r:id="rId19"/>
+      <w:headerReference w:type="default" r:id="rId19"/>
+      <w:footerReference w:type="default" r:id="rId20"/>
       <w:pgSz w:w="12240" w:h="15840"/>
       <w:pgMar w:top="936" w:right="1080" w:bottom="936" w:left="1080" w:header="720" w:footer="720" w:gutter="0"/>
       <w:cols w:space="720"/>
@@ -2910,6 +2693,7 @@
   <w:style w:type="character" w:default="1" w:styleId="DefaultParagraphFont">
     <w:name w:val="Default Paragraph Font"/>
     <w:uiPriority w:val="1"/>
+    <w:semiHidden/>
     <w:unhideWhenUsed/>
   </w:style>
   <w:style w:type="table" w:default="1" w:styleId="TableNormal">

</xml_diff>